<commit_message>
Reword TC09 and TC14 and scope in docs to match what the tests check
Co-Authored-By: Claude Sonnet 5.5 <noreply@anthropic.com>
Claude-Session: https://claude.ai/code/session_012g5kiP5C3akukkpzECr2LK
</commit_message>
<xml_diff>
--- a/docs/SauceDemo_Project_Report.docx
+++ b/docs/SauceDemo_Project_Report.docx
@@ -2851,7 +2851,7 @@
                 <w:sz w:val="20"/>
                 <w:szCs w:val="20"/>
               </w:rPr>
-              <w:t xml:space="preserve">First price is $7.99</w:t>
+              <w:t>First product is "Sauce Labs Onesie" (the cheapest, $7.99)</w:t>
             </w:r>
           </w:p>
         </w:tc>
@@ -3611,7 +3611,7 @@
                 <w:sz w:val="20"/>
                 <w:szCs w:val="20"/>
               </w:rPr>
-              <w:t xml:space="preserve">Overview shows item and $29.99; confirmation "Thank you for your order!"</w:t>
+              <w:t>Overview page opens; confirmation "Thank you for your order!"</w:t>
             </w:r>
           </w:p>
         </w:tc>

</xml_diff>

<commit_message>
Report: add institution, date, department and acknowledgement text
Co-Authored-By: Claude Sonnet 5.5 <noreply@anthropic.com>
Claude-Session: https://claude.ai/code/session_013GSzyjYeifDbbeVp7c3R2X
</commit_message>
<xml_diff>
--- a/docs/SauceDemo_Project_Report.docx
+++ b/docs/SauceDemo_Project_Report.docx
@@ -150,9 +150,8 @@
           <w:bCs/>
           <w:sz w:val="28"/>
           <w:szCs w:val="28"/>
-          <w:highlight w:val="yellow"/>
-        </w:rPr>
-        <w:t xml:space="preserve">[NAME OF INSTITUTION / UNIVERSITY]</w:t>
+        </w:rPr>
+        <w:t xml:space="preserve">CHANDIGARH UNIVERSITY</w:t>
       </w:r>
     </w:p>
     <w:p>
@@ -165,9 +164,8 @@
           <w:rFonts w:ascii="Times New Roman" w:cs="Times New Roman" w:eastAsia="Times New Roman" w:hAnsi="Times New Roman"/>
           <w:sz w:val="26"/>
           <w:szCs w:val="26"/>
-          <w:highlight w:val="yellow"/>
-        </w:rPr>
-        <w:t xml:space="preserve">Month Year</w:t>
+        </w:rPr>
+        <w:t xml:space="preserve">November 2026</w:t>
       </w:r>
     </w:p>
     <w:p>
@@ -295,34 +293,31 @@
       <w:r>
         <w:rPr>
           <w:rFonts w:ascii="Times New Roman" w:cs="Times New Roman" w:eastAsia="Times New Roman" w:hAnsi="Times New Roman"/>
+          <w:sz w:val="24"/>
+          <w:szCs w:val="24"/>
+        </w:rPr>
+        <w:t xml:space="preserve">Department of Computer Science and Engineering</w:t>
+      </w:r>
+      <w:r>
+        <w:rPr>
+          <w:rFonts w:ascii="Times New Roman" w:cs="Times New Roman" w:eastAsia="Times New Roman" w:hAnsi="Times New Roman"/>
+          <w:sz w:val="24"/>
+          <w:szCs w:val="24"/>
+        </w:rPr>
+        <w:t xml:space="preserve">	Department of Computer Science and Engineering</w:t>
+      </w:r>
+    </w:p>
+    <w:p>
+      <w:pPr>
+        <w:spacing w:after="360" w:line="276"/>
+      </w:pPr>
+      <w:r>
+        <w:rPr>
+          <w:rFonts w:ascii="Times New Roman" w:cs="Times New Roman" w:eastAsia="Times New Roman" w:hAnsi="Times New Roman"/>
           <w:sz w:val="26"/>
           <w:szCs w:val="26"/>
-          <w:highlight w:val="yellow"/>
-        </w:rPr>
-        <w:t xml:space="preserve">Department</w:t>
-      </w:r>
-      <w:r>
-        <w:rPr>
-          <w:rFonts w:ascii="Times New Roman" w:cs="Times New Roman" w:eastAsia="Times New Roman" w:hAnsi="Times New Roman"/>
-          <w:sz w:val="26"/>
-          <w:szCs w:val="26"/>
-          <w:highlight w:val="yellow"/>
-        </w:rPr>
-        <w:t xml:space="preserve">	Department</w:t>
-      </w:r>
-    </w:p>
-    <w:p>
-      <w:pPr>
-        <w:spacing w:after="360" w:line="276"/>
-      </w:pPr>
-      <w:r>
-        <w:rPr>
-          <w:rFonts w:ascii="Times New Roman" w:cs="Times New Roman" w:eastAsia="Times New Roman" w:hAnsi="Times New Roman"/>
-          <w:sz w:val="26"/>
-          <w:szCs w:val="26"/>
-          <w:highlight w:val="yellow"/>
-        </w:rPr>
-        <w:t xml:space="preserve">Full address of the institution</w:t>
+        </w:rPr>
+        <w:t xml:space="preserve">Chandigarh University, NH-95 Chandigarh-Ludhiana Highway, Gharuan, Mohali, Punjab - 140413, India</w:t>
       </w:r>
     </w:p>
     <w:p>
@@ -395,24 +390,35 @@
           <w:sz w:val="24"/>
           <w:szCs w:val="24"/>
         </w:rPr>
-        <w:t xml:space="preserve">I would like to express my sincere gratitude to my project supervisor, </w:t>
-      </w:r>
+        <w:t xml:space="preserve">I would like to express my sincere gratitude to my project supervisor for the guidance, encouragement and valuable suggestions given throughout this project. The regular reviews helped me to simplify the project and to concentrate on tests that I could understand, run and explain.</w:t>
+      </w:r>
+    </w:p>
+    <w:p>
+      <w:pPr>
+        <w:spacing w:after="120" w:line="360"/>
+        <w:jc w:val="both"/>
+      </w:pPr>
       <w:r>
         <w:rPr>
           <w:rFonts w:ascii="Times New Roman" w:cs="Times New Roman" w:eastAsia="Times New Roman" w:hAnsi="Times New Roman"/>
           <w:sz w:val="24"/>
           <w:szCs w:val="24"/>
-          <w:highlight w:val="yellow"/>
-        </w:rPr>
-        <w:t xml:space="preserve">Supervisor name and designation</w:t>
-      </w:r>
+        </w:rPr>
+        <w:t xml:space="preserve">I am thankful to the Head of the Department and to the faculty of the Department of Computer Science and Engineering, Chandigarh University, for providing the facilities and the academic environment needed to complete this work.</w:t>
+      </w:r>
+    </w:p>
+    <w:p>
+      <w:pPr>
+        <w:spacing w:after="120" w:line="360"/>
+        <w:jc w:val="both"/>
+      </w:pPr>
       <w:r>
         <w:rPr>
           <w:rFonts w:ascii="Times New Roman" w:cs="Times New Roman" w:eastAsia="Times New Roman" w:hAnsi="Times New Roman"/>
           <w:sz w:val="24"/>
           <w:szCs w:val="24"/>
         </w:rPr>
-        <w:t xml:space="preserve">, for the guidance, encouragement and valuable suggestions given throughout this project. The regular reviews helped me to simplify the project and to concentrate on tests that I could understand, run and explain.</w:t>
+        <w:t xml:space="preserve">I also thank the open-source community behind Playwright, Node.js and Git, whose free tools and documentation made this project possible, and the creators of the SauceDemo application, which offers a safe public website for practising test automation.</w:t>
       </w:r>
     </w:p>
     <w:p>
@@ -426,87 +432,7 @@
           <w:sz w:val="24"/>
           <w:szCs w:val="24"/>
         </w:rPr>
-        <w:t xml:space="preserve">I am thankful to the Head of the Department, </w:t>
-      </w:r>
-      <w:r>
-        <w:rPr>
-          <w:rFonts w:ascii="Times New Roman" w:cs="Times New Roman" w:eastAsia="Times New Roman" w:hAnsi="Times New Roman"/>
-          <w:sz w:val="24"/>
-          <w:szCs w:val="24"/>
-          <w:highlight w:val="yellow"/>
-        </w:rPr>
-        <w:t xml:space="preserve">HOD name</w:t>
-      </w:r>
-      <w:r>
-        <w:rPr>
-          <w:rFonts w:ascii="Times New Roman" w:cs="Times New Roman" w:eastAsia="Times New Roman" w:hAnsi="Times New Roman"/>
-          <w:sz w:val="24"/>
-          <w:szCs w:val="24"/>
-        </w:rPr>
-        <w:t xml:space="preserve">, and to the faculty of the Department of </w:t>
-      </w:r>
-      <w:r>
-        <w:rPr>
-          <w:rFonts w:ascii="Times New Roman" w:cs="Times New Roman" w:eastAsia="Times New Roman" w:hAnsi="Times New Roman"/>
-          <w:sz w:val="24"/>
-          <w:szCs w:val="24"/>
-          <w:highlight w:val="yellow"/>
-        </w:rPr>
-        <w:t xml:space="preserve">Department name</w:t>
-      </w:r>
-      <w:r>
-        <w:rPr>
-          <w:rFonts w:ascii="Times New Roman" w:cs="Times New Roman" w:eastAsia="Times New Roman" w:hAnsi="Times New Roman"/>
-          <w:sz w:val="24"/>
-          <w:szCs w:val="24"/>
-        </w:rPr>
-        <w:t xml:space="preserve">, </w:t>
-      </w:r>
-      <w:r>
-        <w:rPr>
-          <w:rFonts w:ascii="Times New Roman" w:cs="Times New Roman" w:eastAsia="Times New Roman" w:hAnsi="Times New Roman"/>
-          <w:sz w:val="24"/>
-          <w:szCs w:val="24"/>
-          <w:highlight w:val="yellow"/>
-        </w:rPr>
-        <w:t xml:space="preserve">Name of institution</w:t>
-      </w:r>
-      <w:r>
-        <w:rPr>
-          <w:rFonts w:ascii="Times New Roman" w:cs="Times New Roman" w:eastAsia="Times New Roman" w:hAnsi="Times New Roman"/>
-          <w:sz w:val="24"/>
-          <w:szCs w:val="24"/>
-        </w:rPr>
-        <w:t xml:space="preserve">, for providing the facilities and the academic environment needed to complete this work.</w:t>
-      </w:r>
-    </w:p>
-    <w:p>
-      <w:pPr>
-        <w:spacing w:after="120" w:line="360"/>
-        <w:jc w:val="both"/>
-      </w:pPr>
-      <w:r>
-        <w:rPr>
-          <w:rFonts w:ascii="Times New Roman" w:cs="Times New Roman" w:eastAsia="Times New Roman" w:hAnsi="Times New Roman"/>
-          <w:sz w:val="24"/>
-          <w:szCs w:val="24"/>
-        </w:rPr>
-        <w:t xml:space="preserve">I also thank the open-source community behind Playwright, Node.js and Git, whose free tools and documentation made this project possible, and the creators of the SauceDemo application, which offers a safe public website for practising test automation.</w:t>
-      </w:r>
-    </w:p>
-    <w:p>
-      <w:pPr>
-        <w:spacing w:after="120" w:line="360"/>
-        <w:jc w:val="both"/>
-      </w:pPr>
-      <w:r>
-        <w:rPr>
-          <w:rFonts w:ascii="Times New Roman" w:cs="Times New Roman" w:eastAsia="Times New Roman" w:hAnsi="Times New Roman"/>
-          <w:sz w:val="24"/>
-          <w:szCs w:val="24"/>
-          <w:highlight w:val="yellow"/>
-        </w:rPr>
-        <w:t xml:space="preserve">Optional: declare any tools or AI assistance used while preparing the project, as required by your institution. Example: “AI-based assistants were used for guidance on structuring the code and the report; all code was run, checked and understood by me.”</w:t>
+        <w:t xml:space="preserve">Declaration of tools: AI-based assistants were used for guidance on structuring the code and the documents. All code was run on my own computer, the results and screenshots in this report are from my own execution, and I have reviewed and understood the work.</w:t>
       </w:r>
     </w:p>
     <w:p>

</xml_diff>